<commit_message>
auto(daily): dev loop report 2026-06-16
</commit_message>
<xml_diff>
--- a/reports/hypothesis/2026-06-16.docx
+++ b/reports/hypothesis/2026-06-16.docx
@@ -15,7 +15,7 @@
         <w:rPr>
           <w:i/>
         </w:rPr>
-        <w:t>생성일: 2026-06-16 09:15 KST  |  표본: 측정소당 최소 2532건 / 총 12835건</w:t>
+        <w:t>생성일: 2026-06-16 14:30 KST  |  표본: 측정소당 최소 2538건 / 총 12865건</w:t>
       </w:r>
     </w:p>
     <w:p>
@@ -143,7 +143,7 @@
           </w:tcPr>
           <w:p>
             <w:r>
-              <w:t>36.368</w:t>
+              <w:t>36.329</w:t>
             </w:r>
           </w:p>
         </w:tc>
@@ -153,7 +153,7 @@
           </w:tcPr>
           <w:p>
             <w:r>
-              <w:t>33.329</w:t>
+              <w:t>33.287</w:t>
             </w:r>
           </w:p>
         </w:tc>
@@ -163,7 +163,7 @@
           </w:tcPr>
           <w:p>
             <w:r>
-              <w:t>+3.040</w:t>
+              <w:t>+3.042</w:t>
             </w:r>
           </w:p>
         </w:tc>
@@ -215,7 +215,7 @@
           </w:tcPr>
           <w:p>
             <w:r>
-              <w:t>20.371</w:t>
+              <w:t>20.354</w:t>
             </w:r>
           </w:p>
         </w:tc>
@@ -225,7 +225,7 @@
           </w:tcPr>
           <w:p>
             <w:r>
-              <w:t>17.521</w:t>
+              <w:t>17.510</w:t>
             </w:r>
           </w:p>
         </w:tc>
@@ -235,7 +235,7 @@
           </w:tcPr>
           <w:p>
             <w:r>
-              <w:t>+2.850</w:t>
+              <w:t>+2.844</w:t>
             </w:r>
           </w:p>
         </w:tc>
@@ -660,7 +660,7 @@
           </w:tcPr>
           <w:p>
             <w:r>
-              <w:t>32.12</w:t>
+              <w:t>32.15</w:t>
             </w:r>
           </w:p>
         </w:tc>
@@ -722,7 +722,7 @@
           </w:tcPr>
           <w:p>
             <w:r>
-              <w:t>82.08</w:t>
+              <w:t>82.28</w:t>
             </w:r>
           </w:p>
         </w:tc>
@@ -784,7 +784,7 @@
           </w:tcPr>
           <w:p>
             <w:r>
-              <w:t>13.38</w:t>
+              <w:t>13.45</w:t>
             </w:r>
           </w:p>
         </w:tc>
@@ -846,7 +846,7 @@
           </w:tcPr>
           <w:p>
             <w:r>
-              <w:t>165.33</w:t>
+              <w:t>165.05</w:t>
             </w:r>
           </w:p>
         </w:tc>
@@ -876,7 +876,7 @@
           </w:tcPr>
           <w:p>
             <w:r>
-              <w:t>0.051</w:t>
+              <w:t>0.050</w:t>
             </w:r>
           </w:p>
         </w:tc>
@@ -908,7 +908,7 @@
           </w:tcPr>
           <w:p>
             <w:r>
-              <w:t>64.74</w:t>
+              <w:t>64.61</w:t>
             </w:r>
           </w:p>
         </w:tc>
@@ -970,7 +970,7 @@
           </w:tcPr>
           <w:p>
             <w:r>
-              <w:t>147.72</w:t>
+              <w:t>148.42</w:t>
             </w:r>
           </w:p>
         </w:tc>
@@ -1000,7 +1000,7 @@
           </w:tcPr>
           <w:p>
             <w:r>
-              <w:t>0.045</w:t>
+              <w:t>0.046</w:t>
             </w:r>
           </w:p>
         </w:tc>
@@ -1029,7 +1029,7 @@
         <w:pStyle w:val="ListBullet"/>
       </w:pPr>
       <w:r>
-        <w:t>'산단 영향군'가 '베이스라인'보다 평균 2.85 높음 (p=0.0000, 효과크기 작음 d=0.22).</w:t>
+        <w:t>'산단 영향군'가 '베이스라인'보다 평균 2.84 높음 (p=0.0000, 효과크기 작음 d=0.22).</w:t>
       </w:r>
     </w:p>
     <w:p>

</xml_diff>